<commit_message>
Save the 15 trained models (the greenhouses) and the Bible text so seeds can be regrown
Models: baseline, scrambled, shifting, label, carry3 x 3 seeds (SHA256SUMS.txt).
Copies in experiments/models (force-added) and GROW_UNDERSTANDING_2026-10-20/models;
three model zips under GitHub's 100 MB file limit.

Claude-Session: https://claude.ai/code/session_01VCh7XeJpj5JpCzQtSzh7gK
</commit_message>
<xml_diff>
--- a/GROW_UNDERSTANDING_2026-10-20/00_START_HERE_Grow_Understanding.docx
+++ b/GROW_UNDERSTANDING_2026-10-20/00_START_HERE_Grow_Understanding.docx
@@ -2094,6 +2094,40 @@
         <w:t xml:space="preserve">.</w:t>
       </w:r>
     </w:p>
+    <w:p>
+      <w:pPr>
+        <w:numPr>
+          <w:ilvl w:val="0"/>
+          <w:numId w:val="1012"/>
+        </w:numPr>
+        <w:pStyle w:val="Compact"/>
+      </w:pPr>
+      <w:r>
+        <w:rPr>
+          <w:bCs/>
+          <w:b/>
+        </w:rPr>
+        <w:t xml:space="preserve">Models saved (owner’s request).</w:t>
+      </w:r>
+      <w:r>
+        <w:t xml:space="preserve"> </w:t>
+      </w:r>
+      <w:r>
+        <w:t xml:space="preserve">The 15 trained models used here and the Bible text were added to the folder and to git, so the seeds can be regrown after this cloud machine is gone. Fingerprints are in</w:t>
+      </w:r>
+      <w:r>
+        <w:t xml:space="preserve"> </w:t>
+      </w:r>
+      <w:r>
+        <w:rPr>
+          <w:rStyle w:val="VerbatimChar"/>
+        </w:rPr>
+        <w:t xml:space="preserve">models/SHA256SUMS.txt</w:t>
+      </w:r>
+      <w:r>
+        <w:t xml:space="preserve">.</w:t>
+      </w:r>
+    </w:p>
     <w:bookmarkEnd w:id="26"/>
     <w:bookmarkStart w:id="27" w:name="technical-details"/>
     <w:p>
@@ -2471,6 +2505,18 @@
         </w:rPr>
         <w:t xml:space="preserve">To run it:</w:t>
       </w:r>
+    </w:p>
+    <w:p>
+      <w:pPr>
+        <w:numPr>
+          <w:ilvl w:val="1"/>
+          <w:numId w:val="1021"/>
+        </w:numPr>
+        <w:pStyle w:val="Compact"/>
+      </w:pPr>
+      <w:r>
+        <w:t xml:space="preserve">Copy</w:t>
+      </w:r>
       <w:r>
         <w:t xml:space="preserve"> </w:t>
       </w:r>
@@ -2478,58 +2524,91 @@
         <w:rPr>
           <w:rStyle w:val="VerbatimChar"/>
         </w:rPr>
+        <w:t xml:space="preserve">models/*.pt</w:t>
+      </w:r>
+      <w:r>
+        <w:t xml:space="preserve"> </w:t>
+      </w:r>
+      <w:r>
+        <w:t xml:space="preserve">into</w:t>
+      </w:r>
+      <w:r>
+        <w:t xml:space="preserve"> </w:t>
+      </w:r>
+      <w:r>
+        <w:rPr>
+          <w:rStyle w:val="VerbatimChar"/>
+        </w:rPr>
+        <w:t xml:space="preserve">experiments/models/</w:t>
+      </w:r>
+      <w:r>
+        <w:t xml:space="preserve"> </w:t>
+      </w:r>
+      <w:r>
+        <w:t xml:space="preserve">and</w:t>
+      </w:r>
+      <w:r>
+        <w:t xml:space="preserve"> </w:t>
+      </w:r>
+      <w:r>
+        <w:rPr>
+          <w:rStyle w:val="VerbatimChar"/>
+        </w:rPr>
+        <w:t xml:space="preserve">data/KJV.txt</w:t>
+      </w:r>
+      <w:r>
+        <w:t xml:space="preserve"> </w:t>
+      </w:r>
+      <w:r>
+        <w:t xml:space="preserve">into</w:t>
+      </w:r>
+      <w:r>
+        <w:t xml:space="preserve"> </w:t>
+      </w:r>
+      <w:r>
+        <w:rPr>
+          <w:rStyle w:val="VerbatimChar"/>
+        </w:rPr>
+        <w:t xml:space="preserve">experiments/data/</w:t>
+      </w:r>
+      <w:r>
+        <w:t xml:space="preserve">. Those copies are also in git at those same paths.</w:t>
+      </w:r>
+    </w:p>
+    <w:p>
+      <w:pPr>
+        <w:numPr>
+          <w:ilvl w:val="1"/>
+          <w:numId w:val="1021"/>
+        </w:numPr>
+        <w:pStyle w:val="Compact"/>
+      </w:pPr>
+      <w:r>
+        <w:t xml:space="preserve">Run</w:t>
+      </w:r>
+      <w:r>
+        <w:t xml:space="preserve"> </w:t>
+      </w:r>
+      <w:r>
+        <w:rPr>
+          <w:rStyle w:val="VerbatimChar"/>
+        </w:rPr>
         <w:t xml:space="preserve">cd experiments &amp;&amp; python understanding_compression.py</w:t>
       </w:r>
       <w:r>
-        <w:t xml:space="preserve">. It needs the saved models in</w:t>
-      </w:r>
-      <w:r>
-        <w:t xml:space="preserve"> </w:t>
-      </w:r>
-      <w:r>
-        <w:rPr>
-          <w:rStyle w:val="VerbatimChar"/>
-        </w:rPr>
-        <w:t xml:space="preserve">experiments/models/</w:t>
-      </w:r>
-      <w:r>
-        <w:t xml:space="preserve"> </w:t>
-      </w:r>
-      <w:r>
-        <w:t xml:space="preserve">and the Bible text in</w:t>
-      </w:r>
-      <w:r>
-        <w:t xml:space="preserve"> </w:t>
-      </w:r>
-      <w:r>
-        <w:rPr>
-          <w:rStyle w:val="VerbatimChar"/>
-        </w:rPr>
-        <w:t xml:space="preserve">experiments/data/</w:t>
-      </w:r>
-      <w:r>
-        <w:t xml:space="preserve">; both are kept out of git because of their size. The Bible text downloads itself on the first run, from the same public source the other experiments use. The models are rebuilt by the project’s training scripts (</w:t>
-      </w:r>
-      <w:r>
-        <w:rPr>
-          <w:rStyle w:val="VerbatimChar"/>
-        </w:rPr>
-        <w:t xml:space="preserve">confirm.py</w:t>
-      </w:r>
-      <w:r>
-        <w:t xml:space="preserve">,</w:t>
-      </w:r>
-      <w:r>
-        <w:t xml:space="preserve"> </w:t>
-      </w:r>
-      <w:r>
-        <w:rPr>
-          <w:rStyle w:val="VerbatimChar"/>
-        </w:rPr>
-        <w:t xml:space="preserve">method_comparison.py</w:t>
-      </w:r>
-      <w:r>
-        <w:t xml:space="preserve">).</w:t>
+        <w:t xml:space="preserve">.</w:t>
+      </w:r>
+    </w:p>
+    <w:p>
+      <w:pPr>
+        <w:numPr>
+          <w:ilvl w:val="0"/>
+          <w:numId w:val="1000"/>
+        </w:numPr>
+        <w:pStyle w:val="Compact"/>
+      </w:pPr>
+      <w:r>
+        <w:t xml:space="preserve">Exact regrowth also needs the same software versions and 2 threads (see the verdict, point 3).</w:t>
       </w:r>
     </w:p>
     <w:bookmarkEnd w:id="27"/>
@@ -2945,6 +3024,165 @@
               <w:rPr>
                 <w:rStyle w:val="VerbatimChar"/>
               </w:rPr>
+              <w:t xml:space="preserve">models/</w:t>
+            </w:r>
+            <w:r>
+              <w:t xml:space="preserve"> </w:t>
+            </w:r>
+            <w:r>
+              <w:t xml:space="preserve">(15 files,</w:t>
+            </w:r>
+            <w:r>
+              <w:t xml:space="preserve"> </w:t>
+            </w:r>
+            <w:r>
+              <w:rPr>
+                <w:rStyle w:val="VerbatimChar"/>
+              </w:rPr>
+              <w:t xml:space="preserve">*_seed{0,1,2}_steps1500.pt</w:t>
+            </w:r>
+            <w:r>
+              <w:t xml:space="preserve">)</w:t>
+            </w:r>
+          </w:p>
+        </w:tc>
+        <w:tc>
+          <w:tcPr/>
+          <w:p>
+            <w:pPr>
+              <w:pStyle w:val="Compact"/>
+              <w:jc w:val="left"/>
+            </w:pPr>
+            <w:r>
+              <w:t xml:space="preserve">The trained greenhouses: plain Bible (baseline), scrambled, shifting, label, carry3; 3 runs each. About 13.8 MB each</w:t>
+            </w:r>
+          </w:p>
+        </w:tc>
+        <w:tc>
+          <w:tcPr/>
+          <w:p>
+            <w:pPr>
+              <w:pStyle w:val="Compact"/>
+              <w:jc w:val="left"/>
+            </w:pPr>
+            <w:r>
+              <w:rPr>
+                <w:rStyle w:val="VerbatimChar"/>
+              </w:rPr>
+              <w:t xml:space="preserve">experiments/models/</w:t>
+            </w:r>
+            <w:r>
+              <w:t xml:space="preserve"> </w:t>
+            </w:r>
+            <w:r>
+              <w:t xml:space="preserve">(same branch; force-added to git)</w:t>
+            </w:r>
+          </w:p>
+        </w:tc>
+      </w:tr>
+      <w:tr>
+        <w:tc>
+          <w:tcPr/>
+          <w:p>
+            <w:pPr>
+              <w:pStyle w:val="Compact"/>
+              <w:jc w:val="left"/>
+            </w:pPr>
+            <w:r>
+              <w:rPr>
+                <w:rStyle w:val="VerbatimChar"/>
+              </w:rPr>
+              <w:t xml:space="preserve">models/SHA256SUMS.txt</w:t>
+            </w:r>
+          </w:p>
+        </w:tc>
+        <w:tc>
+          <w:tcPr/>
+          <w:p>
+            <w:pPr>
+              <w:pStyle w:val="Compact"/>
+              <w:jc w:val="left"/>
+            </w:pPr>
+            <w:r>
+              <w:t xml:space="preserve">Fingerprints of the 15 models, to prove a copy is identical</w:t>
+            </w:r>
+          </w:p>
+        </w:tc>
+        <w:tc>
+          <w:tcPr/>
+          <w:p>
+            <w:pPr>
+              <w:pStyle w:val="Compact"/>
+              <w:jc w:val="left"/>
+            </w:pPr>
+            <w:r>
+              <w:t xml:space="preserve">made here</w:t>
+            </w:r>
+          </w:p>
+        </w:tc>
+      </w:tr>
+      <w:tr>
+        <w:tc>
+          <w:tcPr/>
+          <w:p>
+            <w:pPr>
+              <w:pStyle w:val="Compact"/>
+              <w:jc w:val="left"/>
+            </w:pPr>
+            <w:r>
+              <w:rPr>
+                <w:rStyle w:val="VerbatimChar"/>
+              </w:rPr>
+              <w:t xml:space="preserve">data/KJV.txt</w:t>
+            </w:r>
+          </w:p>
+        </w:tc>
+        <w:tc>
+          <w:tcPr/>
+          <w:p>
+            <w:pPr>
+              <w:pStyle w:val="Compact"/>
+              <w:jc w:val="left"/>
+            </w:pPr>
+            <w:r>
+              <w:t xml:space="preserve">The King James Bible text (public domain), the soil every model was trained on</w:t>
+            </w:r>
+          </w:p>
+        </w:tc>
+        <w:tc>
+          <w:tcPr/>
+          <w:p>
+            <w:pPr>
+              <w:pStyle w:val="Compact"/>
+              <w:jc w:val="left"/>
+            </w:pPr>
+            <w:r>
+              <w:rPr>
+                <w:rStyle w:val="VerbatimChar"/>
+              </w:rPr>
+              <w:t xml:space="preserve">experiments/data/KJV.txt</w:t>
+            </w:r>
+            <w:r>
+              <w:t xml:space="preserve"> </w:t>
+            </w:r>
+            <w:r>
+              <w:t xml:space="preserve">(same branch; force-added)</w:t>
+            </w:r>
+          </w:p>
+        </w:tc>
+      </w:tr>
+      <w:tr>
+        <w:tc>
+          <w:tcPr/>
+          <w:p>
+            <w:pPr>
+              <w:pStyle w:val="Compact"/>
+              <w:jc w:val="left"/>
+            </w:pPr>
+            <w:r>
+              <w:rPr>
+                <w:rStyle w:val="VerbatimChar"/>
+              </w:rPr>
               <w:t xml:space="preserve">GROW_UNDERSTANDING_2026-10-20.zip</w:t>
             </w:r>
             <w:r>
@@ -2963,7 +3201,118 @@
               <w:jc w:val="left"/>
             </w:pPr>
             <w:r>
-              <w:t xml:space="preserve">This whole folder as a plain zip</w:t>
+              <w:t xml:space="preserve">This whole folder as a plain zip,</w:t>
+            </w:r>
+            <w:r>
+              <w:t xml:space="preserve"> </w:t>
+            </w:r>
+            <w:r>
+              <w:rPr>
+                <w:bCs/>
+                <w:b/>
+              </w:rPr>
+              <w:t xml:space="preserve">except</w:t>
+            </w:r>
+            <w:r>
+              <w:t xml:space="preserve"> </w:t>
+            </w:r>
+            <w:r>
+              <w:rPr>
+                <w:rStyle w:val="VerbatimChar"/>
+              </w:rPr>
+              <w:t xml:space="preserve">models/</w:t>
+            </w:r>
+            <w:r>
+              <w:t xml:space="preserve"> </w:t>
+            </w:r>
+            <w:r>
+              <w:t xml:space="preserve">and</w:t>
+            </w:r>
+            <w:r>
+              <w:t xml:space="preserve"> </w:t>
+            </w:r>
+            <w:r>
+              <w:rPr>
+                <w:rStyle w:val="VerbatimChar"/>
+              </w:rPr>
+              <w:t xml:space="preserve">data/</w:t>
+            </w:r>
+            <w:r>
+              <w:t xml:space="preserve"> </w:t>
+            </w:r>
+            <w:r>
+              <w:t xml:space="preserve">(see below)</w:t>
+            </w:r>
+          </w:p>
+        </w:tc>
+        <w:tc>
+          <w:tcPr/>
+          <w:p>
+            <w:pPr>
+              <w:pStyle w:val="Compact"/>
+              <w:jc w:val="left"/>
+            </w:pPr>
+            <w:r>
+              <w:t xml:space="preserve">repository top level</w:t>
+            </w:r>
+          </w:p>
+        </w:tc>
+      </w:tr>
+      <w:tr>
+        <w:tc>
+          <w:tcPr/>
+          <w:p>
+            <w:pPr>
+              <w:pStyle w:val="Compact"/>
+              <w:jc w:val="left"/>
+            </w:pPr>
+            <w:r>
+              <w:rPr>
+                <w:rStyle w:val="VerbatimChar"/>
+              </w:rPr>
+              <w:t xml:space="preserve">GROW_UNDERSTANDING_2026-10-20_models_seed0.zip</w:t>
+            </w:r>
+            <w:r>
+              <w:t xml:space="preserve">,</w:t>
+            </w:r>
+            <w:r>
+              <w:t xml:space="preserve"> </w:t>
+            </w:r>
+            <w:r>
+              <w:rPr>
+                <w:rStyle w:val="VerbatimChar"/>
+              </w:rPr>
+              <w:t xml:space="preserve">_seed1.zip</w:t>
+            </w:r>
+            <w:r>
+              <w:t xml:space="preserve">,</w:t>
+            </w:r>
+            <w:r>
+              <w:t xml:space="preserve"> </w:t>
+            </w:r>
+            <w:r>
+              <w:rPr>
+                <w:rStyle w:val="VerbatimChar"/>
+              </w:rPr>
+              <w:t xml:space="preserve">_seed2.zip</w:t>
+            </w:r>
+            <w:r>
+              <w:t xml:space="preserve"> </w:t>
+            </w:r>
+            <w:r>
+              <w:t xml:space="preserve">(next to the folder)</w:t>
+            </w:r>
+          </w:p>
+        </w:tc>
+        <w:tc>
+          <w:tcPr/>
+          <w:p>
+            <w:pPr>
+              <w:pStyle w:val="Compact"/>
+              <w:jc w:val="left"/>
+            </w:pPr>
+            <w:r>
+              <w:t xml:space="preserve">The 15 models in three plain zips (5 models each, about 64 MB each), each with the fingerprint list</w:t>
             </w:r>
           </w:p>
         </w:tc>
@@ -3018,7 +3367,7 @@
       <w:pPr>
         <w:numPr>
           <w:ilvl w:val="0"/>
-          <w:numId w:val="1021"/>
+          <w:numId w:val="1022"/>
         </w:numPr>
         <w:pStyle w:val="Compact"/>
       </w:pPr>
@@ -3040,7 +3389,7 @@
       <w:pPr>
         <w:numPr>
           <w:ilvl w:val="0"/>
-          <w:numId w:val="1021"/>
+          <w:numId w:val="1022"/>
         </w:numPr>
         <w:pStyle w:val="Compact"/>
       </w:pPr>
@@ -3062,22 +3411,93 @@
       <w:pPr>
         <w:numPr>
           <w:ilvl w:val="0"/>
-          <w:numId w:val="1021"/>
-        </w:numPr>
-        <w:pStyle w:val="Compact"/>
-      </w:pPr>
-      <w:r>
-        <w:rPr>
-          <w:bCs/>
-          <w:b/>
-        </w:rPr>
-        <w:t xml:space="preserve">The trained models and the Bible text are not in git</w:t>
-      </w:r>
-      <w:r>
-        <w:t xml:space="preserve"> </w:t>
-      </w:r>
-      <w:r>
-        <w:t xml:space="preserve">(about 430 MB of models; the 15 used here are about 210 MB). They live only on this cloud machine, which is deleted after the session. The training scripts can rebuild them, which takes several hours. Without the identical models, the seeds can’t be regrown, because the models are the greenhouse.</w:t>
+          <w:numId w:val="1022"/>
+        </w:numPr>
+        <w:pStyle w:val="Compact"/>
+      </w:pPr>
+      <w:r>
+        <w:rPr>
+          <w:bCs/>
+          <w:b/>
+        </w:rPr>
+        <w:t xml:space="preserve">GitHub refuses any single file over 100 MB.</w:t>
+      </w:r>
+      <w:r>
+        <w:t xml:space="preserve"> </w:t>
+      </w:r>
+      <w:r>
+        <w:t xml:space="preserve">One zip of everything would be about 200 MB, so the models are split into three zips of about 64 MB each, and the main zip leaves out</w:t>
+      </w:r>
+      <w:r>
+        <w:t xml:space="preserve"> </w:t>
+      </w:r>
+      <w:r>
+        <w:rPr>
+          <w:rStyle w:val="VerbatimChar"/>
+        </w:rPr>
+        <w:t xml:space="preserve">models/</w:t>
+      </w:r>
+      <w:r>
+        <w:t xml:space="preserve"> </w:t>
+      </w:r>
+      <w:r>
+        <w:t xml:space="preserve">and</w:t>
+      </w:r>
+      <w:r>
+        <w:t xml:space="preserve"> </w:t>
+      </w:r>
+      <w:r>
+        <w:rPr>
+          <w:rStyle w:val="VerbatimChar"/>
+        </w:rPr>
+        <w:t xml:space="preserve">data/</w:t>
+      </w:r>
+      <w:r>
+        <w:t xml:space="preserve">. Every file is still in the folder on GitHub; nothing is held back.</w:t>
+      </w:r>
+    </w:p>
+    <w:p>
+      <w:pPr>
+        <w:numPr>
+          <w:ilvl w:val="0"/>
+          <w:numId w:val="1022"/>
+        </w:numPr>
+        <w:pStyle w:val="Compact"/>
+      </w:pPr>
+      <w:r>
+        <w:rPr>
+          <w:bCs/>
+          <w:b/>
+        </w:rPr>
+        <w:t xml:space="preserve">Bible text in the main zip.</w:t>
+      </w:r>
+      <w:r>
+        <w:t xml:space="preserve"> </w:t>
+      </w:r>
+      <w:r>
+        <w:t xml:space="preserve">The Bible text (4.4 MB) is not in the main zip; it is in the folder, and it also downloads itself on the first run.</w:t>
+      </w:r>
+    </w:p>
+    <w:p>
+      <w:pPr>
+        <w:numPr>
+          <w:ilvl w:val="0"/>
+          <w:numId w:val="1022"/>
+        </w:numPr>
+        <w:pStyle w:val="Compact"/>
+      </w:pPr>
+      <w:r>
+        <w:rPr>
+          <w:bCs/>
+          <w:b/>
+        </w:rPr>
+        <w:t xml:space="preserve">Other models stay off GitHub.</w:t>
+      </w:r>
+      <w:r>
+        <w:t xml:space="preserve"> </w:t>
+      </w:r>
+      <w:r>
+        <w:t xml:space="preserve">Older models from earlier experiments (Aesop and others, about 220 MB) were not requested and remain only on this cloud machine.</w:t>
       </w:r>
     </w:p>
     <w:bookmarkEnd w:id="29"/>
@@ -3548,6 +3968,36 @@
     </w:lvlOverride>
   </w:num>
   <w:num w:numId="1021">
+    <w:abstractNumId w:val="99411"/>
+    <w:lvlOverride w:ilvl="0">
+      <w:startOverride w:val="1"/>
+    </w:lvlOverride>
+    <w:lvlOverride w:ilvl="1">
+      <w:startOverride w:val="1"/>
+    </w:lvlOverride>
+    <w:lvlOverride w:ilvl="2">
+      <w:startOverride w:val="1"/>
+    </w:lvlOverride>
+    <w:lvlOverride w:ilvl="3">
+      <w:startOverride w:val="1"/>
+    </w:lvlOverride>
+    <w:lvlOverride w:ilvl="4">
+      <w:startOverride w:val="1"/>
+    </w:lvlOverride>
+    <w:lvlOverride w:ilvl="5">
+      <w:startOverride w:val="1"/>
+    </w:lvlOverride>
+    <w:lvlOverride w:ilvl="6">
+      <w:startOverride w:val="1"/>
+    </w:lvlOverride>
+    <w:lvlOverride w:ilvl="7">
+      <w:startOverride w:val="1"/>
+    </w:lvlOverride>
+    <w:lvlOverride w:ilvl="8">
+      <w:startOverride w:val="1"/>
+    </w:lvlOverride>
+  </w:num>
+  <w:num w:numId="1022">
     <w:abstractNumId w:val="991"/>
   </w:num>
 </w:numbering>

</xml_diff>